<commit_message>
Vol 3: add 'The Role Atlas' closing synthesis (laws as field-roles + the equation for Holy) with field diagram + John's Granddaddy note
</commit_message>
<xml_diff>
--- a/_implementation-notes/role-atlas-draft-2026-06-16.docx
+++ b/_implementation-notes/role-atlas-draft-2026-06-16.docx
@@ -1511,31 +1511,26 @@
     </w:p>
     <w:p>
       <w:pPr>
-        <w:pBdr>
-          <w:left w:val="single" w:color="B0B7C0" w:sz="12" w:space="8"/>
-        </w:pBdr>
-        <w:spacing w:after="80"/>
-        <w:ind w:left="480"/>
+        <w:spacing w:after="140"/>
       </w:pPr>
       <w:r>
         <w:rPr>
           <w:b/>
           <w:bCs/>
-        </w:rPr>
-        <w:t xml:space="preserve">A word from your Granddaddy</w:t>
-      </w:r>
-      <w:r>
-        <w:t xml:space="preserve"> — </w:t>
-      </w:r>
-      <w:r>
-        <w:rPr>
-          <w:i/>
-          <w:iCs/>
-        </w:rPr>
-        <w:t xml:space="preserve">[placeholder for John]</w:t>
-      </w:r>
-      <w:r>
-        <w:t xml:space="preserve">: a sentence or two in your own voice about what it has meant to you to find that the holiness you once felt as a wall keeping you out turned out, in Christ, to be the very thing drawing you in. Left blank deliberately rather than inventing a memory.</w:t>
+          <w:i/>
+          <w:iCs/>
+        </w:rPr>
+        <w:t xml:space="preserve">A word from your Granddaddy.</w:t>
+      </w:r>
+      <w:r>
+        <w:t xml:space="preserve"> </w:t>
+      </w:r>
+      <w:r>
+        <w:rPr>
+          <w:i/>
+          <w:iCs/>
+        </w:rPr>
+        <w:t xml:space="preserve">This discussion is what I have been expecting as I started digging into scripture and reflecting on God's laws. There is an integrating underlying picture of how they start to fit together as they show up. And that picture shows us things that we did not see before and predict connections that were not obvious, so that we can align on what God is up to better. This is really exciting. I hope you kids will take this and go further, wherever the Lord leads.</w:t>
       </w:r>
     </w:p>
     <w:sectPr>

</xml_diff>